<commit_message>
Python-001 Added new versions of CV files
</commit_message>
<xml_diff>
--- a/static/documents/Sasa_Rakic_All_Languages_Resume.docx
+++ b/static/documents/Sasa_Rakic_All_Languages_Resume.docx
@@ -239,8 +239,6 @@
         </w:rPr>
         <w:t>Node JS demo project:</w:t>
       </w:r>
-      <w:bookmarkStart w:id="13" w:name="_GoBack"/>
-      <w:bookmarkEnd w:id="13"/>
     </w:p>
     <w:p>
       <w:pPr>
@@ -332,7 +330,6 @@
           <w:position w:val="0"/>
           <w:sz w:val="20"/>
           <w:shd w:val="clear" w:color="auto" w:fill="auto"/>
-          <w:lang w:val="en-US"/>
         </w:rPr>
       </w:pPr>
     </w:p>
@@ -359,7 +356,7 @@
           <w:bCs/>
           <w:lang w:val="en-US"/>
         </w:rPr>
-        <w:t>I am working on creating Laravel 12 shopping cart demo:</w:t>
+        <w:t>Python demo project (Django, Flask, SQLAlchemy, MySqlClient):</w:t>
       </w:r>
     </w:p>
     <w:p>
@@ -372,6 +369,137 @@
         <w:adjustRightInd w:val="0"/>
         <w:spacing w:line="200" w:lineRule="atLeast"/>
         <w:rPr>
+          <w:rFonts w:hint="default" w:ascii="Verdana" w:hAnsi="Verdana" w:eastAsia="Verdana"/>
+          <w:color w:val="000000"/>
+          <w:spacing w:val="0"/>
+          <w:position w:val="0"/>
+          <w:sz w:val="20"/>
+          <w:shd w:val="clear" w:color="auto" w:fill="auto"/>
+        </w:rPr>
+      </w:pPr>
+      <w:r>
+        <w:rPr>
+          <w:rFonts w:hint="default" w:ascii="Verdana" w:hAnsi="Verdana" w:eastAsia="Verdana"/>
+          <w:color w:val="000000"/>
+          <w:spacing w:val="0"/>
+          <w:position w:val="0"/>
+          <w:sz w:val="20"/>
+          <w:shd w:val="clear" w:color="auto" w:fill="auto"/>
+        </w:rPr>
+        <w:fldChar w:fldCharType="begin"/>
+      </w:r>
+      <w:r>
+        <w:rPr>
+          <w:rFonts w:hint="default" w:ascii="Verdana" w:hAnsi="Verdana" w:eastAsia="Verdana"/>
+          <w:color w:val="000000"/>
+          <w:spacing w:val="0"/>
+          <w:position w:val="0"/>
+          <w:sz w:val="20"/>
+          <w:shd w:val="clear" w:color="auto" w:fill="auto"/>
+        </w:rPr>
+        <w:instrText xml:space="preserve"> HYPERLINK "https://github.com/synergia-studio/python-demo-site" </w:instrText>
+      </w:r>
+      <w:r>
+        <w:rPr>
+          <w:rFonts w:hint="default" w:ascii="Verdana" w:hAnsi="Verdana" w:eastAsia="Verdana"/>
+          <w:color w:val="000000"/>
+          <w:spacing w:val="0"/>
+          <w:position w:val="0"/>
+          <w:sz w:val="20"/>
+          <w:shd w:val="clear" w:color="auto" w:fill="auto"/>
+        </w:rPr>
+        <w:fldChar w:fldCharType="separate"/>
+      </w:r>
+      <w:r>
+        <w:rPr>
+          <w:rStyle w:val="9"/>
+          <w:rFonts w:hint="default" w:ascii="Verdana" w:hAnsi="Verdana" w:eastAsia="Verdana"/>
+          <w:spacing w:val="0"/>
+          <w:position w:val="0"/>
+          <w:sz w:val="20"/>
+          <w:shd w:val="clear" w:color="auto" w:fill="auto"/>
+        </w:rPr>
+        <w:t>https://github.com/synergia-studio/python-demo-site</w:t>
+      </w:r>
+      <w:r>
+        <w:rPr>
+          <w:rFonts w:hint="default" w:ascii="Verdana" w:hAnsi="Verdana" w:eastAsia="Verdana"/>
+          <w:color w:val="000000"/>
+          <w:spacing w:val="0"/>
+          <w:position w:val="0"/>
+          <w:sz w:val="20"/>
+          <w:shd w:val="clear" w:color="auto" w:fill="auto"/>
+        </w:rPr>
+        <w:fldChar w:fldCharType="end"/>
+      </w:r>
+    </w:p>
+    <w:p>
+      <w:pPr>
+        <w:tabs>
+          <w:tab w:val="left" w:pos="540"/>
+        </w:tabs>
+        <w:autoSpaceDE w:val="0"/>
+        <w:autoSpaceDN w:val="0"/>
+        <w:adjustRightInd w:val="0"/>
+        <w:spacing w:line="200" w:lineRule="atLeast"/>
+        <w:rPr>
+          <w:rFonts w:hint="default" w:ascii="Verdana" w:hAnsi="Verdana" w:eastAsia="Verdana"/>
+          <w:color w:val="000000"/>
+          <w:spacing w:val="0"/>
+          <w:position w:val="0"/>
+          <w:sz w:val="20"/>
+          <w:shd w:val="clear" w:color="auto" w:fill="auto"/>
+          <w:lang w:val="en-US"/>
+        </w:rPr>
+      </w:pPr>
+    </w:p>
+    <w:p>
+      <w:pPr>
+        <w:tabs>
+          <w:tab w:val="left" w:pos="540"/>
+        </w:tabs>
+        <w:autoSpaceDE w:val="0"/>
+        <w:autoSpaceDN w:val="0"/>
+        <w:adjustRightInd w:val="0"/>
+        <w:spacing w:line="200" w:lineRule="atLeast"/>
+        <w:rPr>
+          <w:rFonts w:hint="default"/>
+          <w:b/>
+          <w:bCs/>
+          <w:lang w:val="en-US"/>
+        </w:rPr>
+      </w:pPr>
+      <w:r>
+        <w:rPr>
+          <w:rFonts w:hint="default"/>
+          <w:b/>
+          <w:bCs/>
+          <w:lang w:val="en-US"/>
+        </w:rPr>
+        <w:t>I am working on creating Laravel 12 shopping cart project</w:t>
+      </w:r>
+      <w:bookmarkStart w:id="13" w:name="_GoBack"/>
+      <w:bookmarkEnd w:id="13"/>
+      <w:r>
+        <w:rPr>
+          <w:rFonts w:hint="default"/>
+          <w:b/>
+          <w:bCs/>
+          <w:lang w:val="en-US"/>
+        </w:rPr>
+        <w:t>:</w:t>
+      </w:r>
+    </w:p>
+    <w:p>
+      <w:pPr>
+        <w:tabs>
+          <w:tab w:val="left" w:pos="540"/>
+        </w:tabs>
+        <w:autoSpaceDE w:val="0"/>
+        <w:autoSpaceDN w:val="0"/>
+        <w:adjustRightInd w:val="0"/>
+        <w:spacing w:line="200" w:lineRule="atLeast"/>
+        <w:rPr>
           <w:rFonts w:hint="default"/>
           <w:lang w:val="en-US"/>
         </w:rPr>
@@ -388,7 +516,7 @@
           <w:rFonts w:hint="default"/>
           <w:lang w:val="en-US"/>
         </w:rPr>
-        <w:instrText xml:space="preserve"> HYPERLINK "http://www.synergia-studio.rs/laravel-12-shopping-cart-demo.zip" </w:instrText>
+        <w:instrText xml:space="preserve"> HYPERLINK "https://github.com/synergia-studio/laravel-12-shopping-cart-demo" </w:instrText>
       </w:r>
       <w:r>
         <w:rPr>
@@ -403,7 +531,7 @@
           <w:rFonts w:hint="default"/>
           <w:lang w:val="en-US"/>
         </w:rPr>
-        <w:t>http://www.synergia-studio.rs/laravel-12-shopping-cart-demo.zip</w:t>
+        <w:t>https://github.com/synergia-studio/laravel-12-shopping-cart-demo</w:t>
       </w:r>
       <w:r>
         <w:rPr>

</xml_diff>